<commit_message>
docs: address commission review of thesis and defense materials
</commit_message>
<xml_diff>
--- a/reports/thesis.docx
+++ b/reports/thesis.docx
@@ -317,11 +317,22 @@
       <w:pPr>
         <w:spacing w:line="240" w:lineRule="auto"/>
         <w:ind w:firstLine="0"/>
+        <w:jc w:val="center"/>
         <w:rPr>
           <w:u w:val="single"/>
           <w:lang w:val="en-US"/>
         </w:rPr>
       </w:pPr>
+      <w:r>
+        <w:rPr>
+          <w:rFonts w:ascii="Times New Roman" w:hAnsi="Times New Roman"/>
+          <w:b/>
+          <w:sz w:val="28"/>
+        </w:rPr>
+        <w:t>«Прогнозирование конечных свойств новых материалов</w:t>
+        <w:br/>
+        <w:t>(композиционных материалов)»</w:t>
+      </w:r>
     </w:p>
     <w:p>
       <w:pPr>
@@ -1246,7 +1257,7 @@
         <w:pageBreakBefore/>
       </w:pPr>
       <w:r>
-        <w:t>1.2 Описание используемых методов: базовый уровень и Ridge</w:t>
+        <w:t>1.2.1 Базовый уровень и Ridge</w:t>
       </w:r>
     </w:p>
     <w:p>
@@ -1262,7 +1273,7 @@
         <w:jc w:val="both"/>
       </w:pPr>
       <w:r>
-        <w:t>Константный baseline прогнозирует среднее train и задаёт минимально необходимую точку сравнения. Сложная модель обоснована только при устойчивом снижении ошибки на неизменном test. Ridge минимизирует квадратичную ошибку с L2-штрафом, уменьшая дисперсию коэффициентов при коррелирующих признаках ценой контролируемого смещения [15]. Он быстр и прозрачен, но без конструирования признаков ограничен почти линейной зависимостью.</w:t>
+        <w:t>Константная модель прогнозирует среднее обучающей цели и задаёт точку сравнения. Конфигурации выбираются по средней ошибке кросс-валидации, после чего зафиксированный выбор один раз оценивается на отложенной части. Ridge минимизирует квадратичную ошибку с L2-штрафом, уменьшая дисперсию коэффициентов при коррелирующих признаках ценой контролируемого смещения [15]. Он быстр и прозрачен, но без конструирования признаков ограничен линейной зависимостью по переданным признакам.</w:t>
       </w:r>
     </w:p>
     <w:p>
@@ -1279,7 +1290,7 @@
         <w:pageBreakBefore/>
       </w:pPr>
       <w:r>
-        <w:t>1.2 Описание используемых методов: ансамбли деревьев</w:t>
+        <w:t>1.2.2 Ансамбли деревьев</w:t>
       </w:r>
     </w:p>
     <w:p>
@@ -1599,7 +1610,7 @@
         <w:pageBreakBefore/>
       </w:pPr>
       <w:r>
-        <w:t>1.2 Описание используемых методов: SVR и MLP</w:t>
+        <w:t>1.2.3 SVR и MLP</w:t>
       </w:r>
     </w:p>
     <w:p>
@@ -1615,7 +1626,7 @@
         <w:jc w:val="both"/>
       </w:pPr>
       <w:r>
-        <w:t>MLP чередует линейные преобразования и нелинейные активации, а обратное распространение вычисляет изменение весов для уменьшения потерь [22]. На небольшой табличной выборке сеть гибка, но вариативна и склонна к переобучению. Регуляризация ограничивает сложность; dropout является одним из известных подходов [23], а используемый MLPRegressor применяет L2-штраф, компактную архитектуру и раннюю остановку.</w:t>
+        <w:t>MLP чередует линейные преобразования и нелинейные активации. Обратное распространение вычисляет градиенты функции потерь, а оптимизатор обновляет веса [22]. На небольшой табличной выборке сеть гибка, но вариативна и склонна к переобучению. Регуляризация ограничивает сложность; dropout является одним из известных подходов [23], а используемый MLPRegressor применяет L2-штраф, компактную архитектуру и раннюю остановку.</w:t>
       </w:r>
     </w:p>
     <w:p>
@@ -1623,7 +1634,7 @@
         <w:jc w:val="both"/>
       </w:pPr>
       <w:r>
-        <w:t>Ни одно семейство нельзя заранее объявить лучшим. Ridge проверяет линейный сигнал, лес усредняет деревья, бустинг последовательно исправляет ошибки, а SVR и MLP требуют особенно аккуратного масштаба. Сравнение учитывает среднее и разброс ошибок по фолдам, разрыв train/test и устойчивость. Нейросеть оценивает наблюдаемое отношение, но не решает обратную задачу и не оптимизирует физический состав.</w:t>
+        <w:t>Ни одно семейство нельзя заранее объявить лучшим. Нейросеть выполняет обратную регрессию отношения по заданному полному профилю, включая механические свойства. Это принятая математическая трактовка рекомендации, но не физическая оптимизация состава: управляемые переменные, ограничения, причинность и экспериментальная проверка отсутствуют.</w:t>
       </w:r>
     </w:p>
     <w:p>
@@ -1632,7 +1643,7 @@
         <w:pageBreakBefore/>
       </w:pPr>
       <w:r>
-        <w:t>1.2 Оценка качества, утечки и интерпретация</w:t>
+        <w:t>1.2.4 Оценка качества, утечки и интерпретация</w:t>
       </w:r>
     </w:p>
     <w:p>
@@ -1640,7 +1651,7 @@
         <w:jc w:val="both"/>
       </w:pPr>
       <w:r>
-        <w:t>Отложенные 30% используются один раз после выбора, а десятифолдовая CV выполняется только на train. Число фолдов связано с компромиссом смещения и дисперсии оценки [17]. GridSearchCV перебирает фиксированную сетку [26], а обучаемые преобразования помещаются в pipeline: обработка до разделения переносит информацию из проверки и завышает качество [25]. CV, использованная для выбора, не является независимой итоговой оценкой [24], [9].</w:t>
+        <w:t>Отложенные 30% используются один раз после выбора, а десятифолдовая CV выполняется только на обучающей части [17]. GridSearchCV перебирает фиксированную сетку [26]; преобразования помещаются в pipeline, поскольку обработка до разделения переносит информацию из проверки [25]. CV для выбора не является независимой итоговой оценкой [24], [9].</w:t>
       </w:r>
     </w:p>
     <w:p>
@@ -1648,15 +1659,54 @@
         <w:jc w:val="both"/>
       </w:pPr>
       <w:r>
-        <w:t>MAE — среднее абсолютное отклонение [27]; RMSE сильнее реагирует на крупные промахи [30]; R² сравнивает модель с прогнозом среднего и может быть отрицательным [29]. R² информативен [10], но не заменяет ошибки в ГПа или МПа. Поэтому все три метрики приводятся отдельно для train/test без универсального порога приемлемости.</w:t>
-      </w:r>
+        <w:t>MAE — среднее абсолютное отклонение [27], RMSE сильнее реагирует на крупные промахи [30], R² сравнивает ошибки с отклонениями от среднего и может быть отрицательным [29], [10]. Метрики приводятся раздельно без универсального порога приемлемости. Пермутационная важность описывает поведение модели, а не причинный механизм [28].</w:t>
+      </w:r>
+    </w:p>
+    <w:p>
+      <w:pPr>
+        <w:ind w:firstLine="0"/>
+        <w:jc w:val="center"/>
+      </w:pPr>
+      <m:oMathPara>
+        <m:oMath>
+          <m:r>
+            <m:t>RMSE = √[(1/n)∑ᵢ₌₁ⁿ(yᵢ − ŷᵢ)²].                                    (1)</m:t>
+          </m:r>
+        </m:oMath>
+      </m:oMathPara>
+    </w:p>
+    <w:p>
+      <w:pPr>
+        <w:ind w:firstLine="0"/>
+        <w:jc w:val="center"/>
+      </w:pPr>
+      <m:oMathPara>
+        <m:oMath>
+          <m:r>
+            <m:t>MAE = (1/n)∑ᵢ₌₁ⁿ|yᵢ − ŷᵢ|.                                           (2)</m:t>
+          </m:r>
+        </m:oMath>
+      </m:oMathPara>
+    </w:p>
+    <w:p>
+      <w:pPr>
+        <w:ind w:firstLine="0"/>
+        <w:jc w:val="center"/>
+      </w:pPr>
+      <m:oMathPara>
+        <m:oMath>
+          <m:r>
+            <m:t>R² = 1 − ∑ᵢ₌₁ⁿ(yᵢ − ŷᵢ)² / ∑ᵢ₌₁ⁿ(yᵢ − ȳ)².                     (3)</m:t>
+          </m:r>
+        </m:oMath>
+      </m:oMathPara>
     </w:p>
     <w:p>
       <w:pPr>
         <w:jc w:val="both"/>
       </w:pPr>
       <w:r>
-        <w:t>SHAP формирует аддитивные локальные вклады [18], а permutation importance измеряет ухудшение качества после перестановки столбца [28]. Оба метода описывают поведение модели, а не причинный механизм. Коррелирующие признаки могут делить информацию, а отрицательная пермутационная оценка возможна из-за вариативности ограниченного test.</w:t>
+        <w:t>Здесь n — число наблюдений оцениваемой выборки, yᵢ и ŷᵢ — фактическое и прогнозное значения, а ȳ — среднее y именно этой выборки. Поэтому константная модель, обученная на среднем обучающей части, может иметь отрицательный R² на отложенной части.</w:t>
       </w:r>
     </w:p>
     <w:p>
@@ -1934,7 +1984,7 @@
         <w:jc w:val="both"/>
       </w:pPr>
       <w:r>
-        <w:t>Максимум |Pearson| равен 0,1190618657 для угла и плотности нашивки. Низкие парные коэффициенты не исключают нелинейную или совместную информацию; вывод о моделируемости делается по оценке моделей.</w:t>
+        <w:t>Максимум |Pearson| равен 0,119 для угла и плотности нашивки. Низкие парные коэффициенты не исключают нелинейную или совместную информацию; вывод о качестве ограничен испытанными моделями и сетками.</w:t>
       </w:r>
     </w:p>
     <w:p>
@@ -2450,7 +2500,7 @@
         <w:pStyle w:val="Heading2"/>
       </w:pPr>
       <w:r>
-        <w:t>2.1 Статистики, выбросы и корреляции</w:t>
+        <w:t>2.1.1 Статистики, выбросы и корреляции</w:t>
       </w:r>
     </w:p>
     <w:p>
@@ -2491,7 +2541,7 @@
         <w:pageBreakBefore/>
       </w:pPr>
       <w:r>
-        <w:t>2.1 Распределения до и после нормализации</w:t>
+        <w:t>2.1.2 Распределения до и после нормализации</w:t>
       </w:r>
     </w:p>
     <w:p>
@@ -2499,7 +2549,15 @@
         <w:jc w:val="both"/>
       </w:pPr>
       <w:r>
-        <w:t>На рисунке 2 показаны реальные распределения train. MinMaxScaler обучен на train только для иллюстрации 13 полей. Ни одна модель не обучается на этих MinMax-преобразованных данных: StandardScaler для X и, где предусмотрено, для y находится внутри CV-pipeline Ridge, SVR и MLP; деревья получают исходный масштаб.</w:t>
+        <w:t>MinMaxScaler обучен на 716 обучающих строках только для иллюстрации 13 полей. Модели не используют эти преобразованные данные: StandardScaler для X и, где предусмотрено, для y оценивается внутри каждого фолда Ridge, SVR и MLP; деревья получают исходный масштаб.</w:t>
+      </w:r>
+    </w:p>
+    <w:p>
+      <w:pPr>
+        <w:jc w:val="both"/>
+      </w:pPr>
+      <w:r>
+        <w:t>На рисунке 2 сопоставлены отношение компонентов, плотность и модуль упругости. После линейного преобразования в диапазон [0; 1] сохраняются форма распределения, асимметрия и взаимный порядок наблюдений; различие физических единиц устраняется только для сопоставления графиков.</w:t>
       </w:r>
     </w:p>
     <w:p>
@@ -2557,7 +2615,7 @@
         <w:pageBreakBefore/>
       </w:pPr>
       <w:r>
-        <w:t>2.1 Распределения до и после нормализации</w:t>
+        <w:t>2.1.2 Распределения до и после нормализации (продолжение)</w:t>
       </w:r>
     </w:p>
     <w:p>
@@ -2565,7 +2623,7 @@
         <w:jc w:val="both"/>
       </w:pPr>
       <w:r>
-        <w:t>На рисунке 3 показаны реальные распределения train. MinMaxScaler обучен на train только для иллюстрации 13 полей. Ни одна модель не обучается на этих MinMax-преобразованных данных: StandardScaler для X и, где предусмотрено, для y находится внутри CV-pipeline Ridge, SVR и MLP; деревья получают исходный масштаб.</w:t>
+        <w:t>На рисунке 3 представлены количество отвердителя, содержание эпоксидных групп и температура вспышки. Масштабирование не устраняет длинные хвосты и не меняет неопределённую семантику исходных единиц; значения не получают новой физической трактовки.</w:t>
       </w:r>
     </w:p>
     <w:p>
@@ -2623,7 +2681,7 @@
         <w:pageBreakBefore/>
       </w:pPr>
       <w:r>
-        <w:t>2.1 Распределения до и после нормализации</w:t>
+        <w:t>2.1.2 Распределения до и после нормализации (продолжение)</w:t>
       </w:r>
     </w:p>
     <w:p>
@@ -2631,7 +2689,7 @@
         <w:jc w:val="both"/>
       </w:pPr>
       <w:r>
-        <w:t>На рисунке 4 показаны реальные распределения train. MinMaxScaler обучен на train только для иллюстрации 13 полей. Ни одна модель не обучается на этих MinMax-преобразованных данных: StandardScaler для X и, где предусмотрено, для y находится внутри CV-pipeline Ridge, SVR и MLP; деревья получают исходный масштаб.</w:t>
+        <w:t>На рисунке 4 показаны поверхностная плотность и две целевые механические характеристики. Их диапазоны различаются, а преобразование лишь переводит каждую переменную в общую числовую шкалу; цели не смешиваются и оцениваются раздельно.</w:t>
       </w:r>
     </w:p>
     <w:p>
@@ -2689,7 +2747,7 @@
         <w:pageBreakBefore/>
       </w:pPr>
       <w:r>
-        <w:t>2.1 Распределения до и после нормализации</w:t>
+        <w:t>2.1.2 Распределения до и после нормализации (продолжение)</w:t>
       </w:r>
     </w:p>
     <w:p>
@@ -2697,7 +2755,7 @@
         <w:jc w:val="both"/>
       </w:pPr>
       <w:r>
-        <w:t>На рисунке 5 показаны реальные распределения train. MinMaxScaler обучен на train только для иллюстрации 13 полей. Ни одна модель не обучается на этих MinMax-преобразованных данных: StandardScaler для X и, где предусмотрено, для y находится внутри CV-pipeline Ridge, SVR и MLP; деревья получают исходный масштаб.</w:t>
+        <w:t>На рисунке 5 сопоставлены потребление смолы и бинарный угол нашивки. Угол сохраняет два уровня, соответствующие 0° и 90°; непрерывная интерпретация промежуточных углов из этих данных невозможна.</w:t>
       </w:r>
     </w:p>
     <w:p>
@@ -2755,7 +2813,7 @@
         <w:pageBreakBefore/>
       </w:pPr>
       <w:r>
-        <w:t>2.1 Распределения до и после нормализации</w:t>
+        <w:t>2.1.2 Распределения до и после нормализации (продолжение)</w:t>
       </w:r>
     </w:p>
     <w:p>
@@ -2763,7 +2821,7 @@
         <w:jc w:val="both"/>
       </w:pPr>
       <w:r>
-        <w:t>На рисунке 6 показаны реальные распределения train. MinMaxScaler обучен на train только для иллюстрации 13 полей. Ни одна модель не обучается на этих MinMax-преобразованных данных: StandardScaler для X и, где предусмотрено, для y находится внутри CV-pipeline Ridge, SVR и MLP; деревья получают исходный масштаб.</w:t>
+        <w:t>На рисунке 6 показаны шаг и плотность нашивки. Неизвестные единицы ограничивают физическое толкование, однако линейное масштабирование сохраняет наблюдавшиеся относительные различия. Эти иллюстрационные преобразования не используются при обучении моделей.</w:t>
       </w:r>
     </w:p>
     <w:p>
@@ -2821,7 +2879,7 @@
         <w:pageBreakBefore/>
       </w:pPr>
       <w:r>
-        <w:t>2.1 Решения по предобработке</w:t>
+        <w:t>2.1.3 Решения по предобработке</w:t>
       </w:r>
     </w:p>
     <w:p>
@@ -2837,7 +2895,7 @@
         <w:jc w:val="both"/>
       </w:pPr>
       <w:r>
-        <w:t>Границы IQR не применяются к тестовой части и не используются как автоматическое доказательство ошибки. Если в модельном эксперименте сравниваются raw и filtered варианты, правило фильтрации обучается только внутри тренировочных фолдов. Итоговый выбор должен опираться на CV, а тест открывается после фиксации конфигурации.</w:t>
+        <w:t>Выполнено сравнение вариантов без удаления и с IQR-фильтрацией. На полном обучающем наборе фильтр по 11 входам исключал 53 из 716 строк для обеих прямых задач (оставалось 663), а по 12 входам обратной регрессии отношения — 61 строку (оставалось 655); для MLP CV RMSE изменилась с 0,935319 до 0,937889. Границы в каждом фолде оценивались только на его обучающей части, X и y фильтровались синхронно, а validation и test не удалялись. По средней CV RMSE для выбранных моделей сохранён вариант без удаления.</w:t>
       </w:r>
     </w:p>
     <w:p>
@@ -2862,7 +2920,7 @@
         <w:jc w:val="both"/>
       </w:pPr>
       <w:r>
-        <w:t>Для прямых целей сравниваются baseline, Ridge, Random Forest, Gradient Boosting и SVR; для отношения — baseline и MLPRegressor. GridSearchCV с десятью фолдами работает только на 716 строках train. Обучаемые преобразования находятся внутри pipeline, основной критерий — RMSE, дополнительно сохраняются MAE и R²; random_state=42.</w:t>
+        <w:t>Для прямых целей сравниваются константная модель, Ridge, Random Forest, Gradient Boosting и SVR; для отношения — константная модель и MLPRegressor. GridSearchCV с десятью фолдами работает только на 716 обучающих строках. Обучаемые преобразования находятся внутри pipeline, основной критерий — средняя RMSE, дополнительно сохраняются MAE и R²; random_state=42.</w:t>
       </w:r>
     </w:p>
     <w:p>
@@ -2870,7 +2928,7 @@
         <w:jc w:val="both"/>
       </w:pPr>
       <w:r>
-        <w:t>Выбор зафиксирован до открытия test: для модуля — baseline, для прочности — Gradient Boosting. Его преимущество по CV RMSE над baseline лишь 0,291 МПа при стандартном отклонении 23,852 МПа.</w:t>
+        <w:t>Выбор зафиксирован до оценки на отложенной части: для модуля — константная модель, для прочности — Gradient Boosting. Последний лучше константной модели в 4 из 10 фолдов, а константная модель — в 6; средняя парная разность RMSE равна +0,291 МПа при стандартном отклонении 8,345 МПа. Формальная значимость превосходства не установлена.</w:t>
       </w:r>
     </w:p>
     <w:p>
@@ -2889,7 +2947,7 @@
       <w:r>
         <w:drawing>
           <wp:inline xmlns:a="http://schemas.openxmlformats.org/drawingml/2006/main" xmlns:pic="http://schemas.openxmlformats.org/drawingml/2006/picture">
-            <wp:extent cx="2592000" cy="1497600"/>
+            <wp:extent cx="4320000" cy="2496000"/>
             <wp:docPr id="7" name="Picture 7"/>
             <wp:cNvGraphicFramePr>
               <a:graphicFrameLocks noChangeAspect="1"/>
@@ -2910,7 +2968,7 @@
                   <pic:spPr>
                     <a:xfrm>
                       <a:off x="0" y="0"/>
-                      <a:ext cx="2592000" cy="1497600"/>
+                      <a:ext cx="4320000" cy="2496000"/>
                     </a:xfrm>
                     <a:prstGeom prst="rect"/>
                   </pic:spPr>
@@ -2935,7 +2993,7 @@
         <w:jc w:val="both"/>
       </w:pPr>
       <w:r>
-        <w:t>Сетки: Ridge alpha 0,01–100; Random Forest — четыре сочетания; Gradient Boosting — learning_rate 0,03/0,1, max_depth 2/3 и 150 деревьев; SVR — C 0,3/1/3 и epsilon 0,05/0,1. Проверены raw и iqr_filtered варианты.</w:t>
+        <w:t>Сетки: Ridge alpha ∈ {0,01; 0,1; 1; 10; 100}; Random Forest — (n_estimators, max_depth, min_samples_leaf) ∈ {(200, None, 1), (150, None, 3), (200, 10, 1), (150, 10, 3)}; Gradient Boosting — learning_rate ∈ {0,03; 0,1}, max_depth ∈ {2; 3}, n_estimators=150; SVR — C ∈ {0,3; 1; 3}, epsilon ∈ {0,05; 0,1}, gamma=scale. Проверены варианты без удаления и с IQR-фильтрацией.</w:t>
       </w:r>
     </w:p>
     <w:p>
@@ -3410,7 +3468,7 @@
         <w:pStyle w:val="Heading2"/>
       </w:pPr>
       <w:r>
-        <w:t>2.2 Результаты перекрёстной проверки</w:t>
+        <w:t>2.2.1 Результаты перекрёстной проверки</w:t>
       </w:r>
     </w:p>
     <w:p>
@@ -3418,7 +3476,7 @@
         <w:jc w:val="both"/>
       </w:pPr>
       <w:r>
-        <w:t>Таблица 6 отражает train-only выбор. Значения test не участвовали в ранжировании. RMSE и MAE выражены в единицах соответствующей строки (ГПа, МПа либо исходная единица отношения с неуказанной базой), R² безразмерен. Для модуля выбран baseline; для прочности преимущество Gradient Boosting над baseline по CV RMSE равно 0,291 МПа и мало относительно межфолдового стандартного отклонения 23,852 МПа. MLP уступает baseline.</w:t>
+        <w:t>Таблица 6 отражает выбор по обучающей части; отложенные значения не участвовали в ранжировании. Для модуля выбрана константная модель. Для прочности Gradient Boosting лучше в 4 из 10 фолдов, константная модель — в 6; средняя парная разность RMSE равна +0,291 МПа при SD 8,345 МПа. Формальная значимость не установлена. MLP уступает константной модели.</w:t>
       </w:r>
     </w:p>
     <w:p>
@@ -4566,7 +4624,7 @@
                 <w:color w:val="000000"/>
                 <w:sz w:val="24"/>
               </w:rPr>
-              <w:t>3.095</w:t>
+              <w:t>3,095</w:t>
             </w:r>
           </w:p>
         </w:tc>
@@ -4587,7 +4645,7 @@
                 <w:color w:val="000000"/>
                 <w:sz w:val="24"/>
               </w:rPr>
-              <w:t>3.178</w:t>
+              <w:t>3,178</w:t>
             </w:r>
           </w:p>
         </w:tc>
@@ -4608,7 +4666,7 @@
                 <w:color w:val="000000"/>
                 <w:sz w:val="24"/>
               </w:rPr>
-              <w:t>2.556</w:t>
+              <w:t>2,556</w:t>
             </w:r>
           </w:p>
         </w:tc>
@@ -4629,7 +4687,7 @@
                 <w:color w:val="000000"/>
                 <w:sz w:val="24"/>
               </w:rPr>
-              <w:t>-0.016</w:t>
+              <w:t>-0,016</w:t>
             </w:r>
           </w:p>
         </w:tc>
@@ -4694,7 +4752,7 @@
                 <w:color w:val="000000"/>
                 <w:sz w:val="24"/>
               </w:rPr>
-              <w:t>3.066</w:t>
+              <w:t>3,066</w:t>
             </w:r>
           </w:p>
         </w:tc>
@@ -4715,7 +4773,7 @@
                 <w:color w:val="000000"/>
                 <w:sz w:val="24"/>
               </w:rPr>
-              <w:t>3.190</w:t>
+              <w:t>3,190</w:t>
             </w:r>
           </w:p>
         </w:tc>
@@ -4736,7 +4794,7 @@
                 <w:color w:val="000000"/>
                 <w:sz w:val="24"/>
               </w:rPr>
-              <w:t>2.567</w:t>
+              <w:t>2,567</w:t>
             </w:r>
           </w:p>
         </w:tc>
@@ -4757,7 +4815,7 @@
                 <w:color w:val="000000"/>
                 <w:sz w:val="24"/>
               </w:rPr>
-              <w:t>-0.024</w:t>
+              <w:t>-0,024</w:t>
             </w:r>
           </w:p>
         </w:tc>
@@ -4822,7 +4880,7 @@
                 <w:color w:val="000000"/>
                 <w:sz w:val="24"/>
               </w:rPr>
-              <w:t>2.867</w:t>
+              <w:t>2,867</w:t>
             </w:r>
           </w:p>
         </w:tc>
@@ -4843,7 +4901,7 @@
                 <w:color w:val="000000"/>
                 <w:sz w:val="24"/>
               </w:rPr>
-              <w:t>3.221</w:t>
+              <w:t>3,221</w:t>
             </w:r>
           </w:p>
         </w:tc>
@@ -4864,7 +4922,7 @@
                 <w:color w:val="000000"/>
                 <w:sz w:val="24"/>
               </w:rPr>
-              <w:t>2.587</w:t>
+              <w:t>2,587</w:t>
             </w:r>
           </w:p>
         </w:tc>
@@ -4885,7 +4943,7 @@
                 <w:color w:val="000000"/>
                 <w:sz w:val="24"/>
               </w:rPr>
-              <w:t>-0.044</w:t>
+              <w:t>-0,044</w:t>
             </w:r>
           </w:p>
         </w:tc>
@@ -4950,7 +5008,7 @@
                 <w:color w:val="000000"/>
                 <w:sz w:val="24"/>
               </w:rPr>
-              <w:t>1.817</w:t>
+              <w:t>1,817</w:t>
             </w:r>
           </w:p>
         </w:tc>
@@ -4971,7 +5029,7 @@
                 <w:color w:val="000000"/>
                 <w:sz w:val="24"/>
               </w:rPr>
-              <w:t>3.311</w:t>
+              <w:t>3,311</w:t>
             </w:r>
           </w:p>
         </w:tc>
@@ -4992,7 +5050,7 @@
                 <w:color w:val="000000"/>
                 <w:sz w:val="24"/>
               </w:rPr>
-              <w:t>2.643</w:t>
+              <w:t>2,643</w:t>
             </w:r>
           </w:p>
         </w:tc>
@@ -5013,7 +5071,7 @@
                 <w:color w:val="000000"/>
                 <w:sz w:val="24"/>
               </w:rPr>
-              <w:t>-0.104</w:t>
+              <w:t>-0,104</w:t>
             </w:r>
           </w:p>
         </w:tc>
@@ -5078,7 +5136,7 @@
                 <w:color w:val="000000"/>
                 <w:sz w:val="24"/>
               </w:rPr>
-              <w:t>2.813</w:t>
+              <w:t>2,813</w:t>
             </w:r>
           </w:p>
         </w:tc>
@@ -5099,7 +5157,7 @@
                 <w:color w:val="000000"/>
                 <w:sz w:val="24"/>
               </w:rPr>
-              <w:t>3.263</w:t>
+              <w:t>3,263</w:t>
             </w:r>
           </w:p>
         </w:tc>
@@ -5120,7 +5178,7 @@
                 <w:color w:val="000000"/>
                 <w:sz w:val="24"/>
               </w:rPr>
-              <w:t>2.623</w:t>
+              <w:t>2,623</w:t>
             </w:r>
           </w:p>
         </w:tc>
@@ -5141,7 +5199,7 @@
                 <w:color w:val="000000"/>
                 <w:sz w:val="24"/>
               </w:rPr>
-              <w:t>-0.072</w:t>
+              <w:t>-0,072</w:t>
             </w:r>
           </w:p>
         </w:tc>
@@ -5206,7 +5264,7 @@
                 <w:color w:val="000000"/>
                 <w:sz w:val="24"/>
               </w:rPr>
-              <w:t>490.497</w:t>
+              <w:t>490,497</w:t>
             </w:r>
           </w:p>
         </w:tc>
@@ -5227,7 +5285,7 @@
                 <w:color w:val="000000"/>
                 <w:sz w:val="24"/>
               </w:rPr>
-              <w:t>473.288</w:t>
+              <w:t>473,288</w:t>
             </w:r>
           </w:p>
         </w:tc>
@@ -5248,7 +5306,7 @@
                 <w:color w:val="000000"/>
                 <w:sz w:val="24"/>
               </w:rPr>
-              <w:t>378.984</w:t>
+              <w:t>378,984</w:t>
             </w:r>
           </w:p>
         </w:tc>
@@ -5269,7 +5327,7 @@
                 <w:color w:val="000000"/>
                 <w:sz w:val="24"/>
               </w:rPr>
-              <w:t>-0.000</w:t>
+              <w:t>-0,000</w:t>
             </w:r>
           </w:p>
         </w:tc>
@@ -5334,7 +5392,7 @@
                 <w:color w:val="000000"/>
                 <w:sz w:val="24"/>
               </w:rPr>
-              <w:t>485.154</w:t>
+              <w:t>485,154</w:t>
             </w:r>
           </w:p>
         </w:tc>
@@ -5355,7 +5413,7 @@
                 <w:color w:val="000000"/>
                 <w:sz w:val="24"/>
               </w:rPr>
-              <w:t>471.726</w:t>
+              <w:t>471,726</w:t>
             </w:r>
           </w:p>
         </w:tc>
@@ -5376,7 +5434,7 @@
                 <w:color w:val="000000"/>
                 <w:sz w:val="24"/>
               </w:rPr>
-              <w:t>378.437</w:t>
+              <w:t>378,437</w:t>
             </w:r>
           </w:p>
         </w:tc>
@@ -5397,7 +5455,7 @@
                 <w:color w:val="000000"/>
                 <w:sz w:val="24"/>
               </w:rPr>
-              <w:t>0.006</w:t>
+              <w:t>0,006</w:t>
             </w:r>
           </w:p>
         </w:tc>
@@ -5462,7 +5520,7 @@
                 <w:color w:val="000000"/>
                 <w:sz w:val="24"/>
               </w:rPr>
-              <w:t>447.149</w:t>
+              <w:t>447,149</w:t>
             </w:r>
           </w:p>
         </w:tc>
@@ -5483,7 +5541,7 @@
                 <w:color w:val="000000"/>
                 <w:sz w:val="24"/>
               </w:rPr>
-              <w:t>471.410</w:t>
+              <w:t>471,410</w:t>
             </w:r>
           </w:p>
         </w:tc>
@@ -5504,7 +5562,7 @@
                 <w:color w:val="000000"/>
                 <w:sz w:val="24"/>
               </w:rPr>
-              <w:t>380.152</w:t>
+              <w:t>380,152</w:t>
             </w:r>
           </w:p>
         </w:tc>
@@ -5525,7 +5583,7 @@
                 <w:color w:val="000000"/>
                 <w:sz w:val="24"/>
               </w:rPr>
-              <w:t>0.008</w:t>
+              <w:t>0,008</w:t>
             </w:r>
           </w:p>
         </w:tc>
@@ -5590,7 +5648,7 @@
                 <w:color w:val="000000"/>
                 <w:sz w:val="24"/>
               </w:rPr>
-              <w:t>298.601</w:t>
+              <w:t>298,601</w:t>
             </w:r>
           </w:p>
         </w:tc>
@@ -5611,7 +5669,7 @@
                 <w:color w:val="000000"/>
                 <w:sz w:val="24"/>
               </w:rPr>
-              <w:t>476.225</w:t>
+              <w:t>476,225</w:t>
             </w:r>
           </w:p>
         </w:tc>
@@ -5632,7 +5690,7 @@
                 <w:color w:val="000000"/>
                 <w:sz w:val="24"/>
               </w:rPr>
-              <w:t>381.814</w:t>
+              <w:t>381,814</w:t>
             </w:r>
           </w:p>
         </w:tc>
@@ -5653,7 +5711,7 @@
                 <w:color w:val="000000"/>
                 <w:sz w:val="24"/>
               </w:rPr>
-              <w:t>-0.013</w:t>
+              <w:t>-0,013</w:t>
             </w:r>
           </w:p>
         </w:tc>
@@ -5718,7 +5776,7 @@
                 <w:color w:val="000000"/>
                 <w:sz w:val="24"/>
               </w:rPr>
-              <w:t>446.934</w:t>
+              <w:t>446,934</w:t>
             </w:r>
           </w:p>
         </w:tc>
@@ -5739,7 +5797,7 @@
                 <w:color w:val="000000"/>
                 <w:sz w:val="24"/>
               </w:rPr>
-              <w:t>484.995</w:t>
+              <w:t>484,995</w:t>
             </w:r>
           </w:p>
         </w:tc>
@@ -5760,7 +5818,7 @@
                 <w:color w:val="000000"/>
                 <w:sz w:val="24"/>
               </w:rPr>
-              <w:t>390.329</w:t>
+              <w:t>390,329</w:t>
             </w:r>
           </w:p>
         </w:tc>
@@ -5781,7 +5839,7 @@
                 <w:color w:val="000000"/>
                 <w:sz w:val="24"/>
               </w:rPr>
-              <w:t>-0.050</w:t>
+              <w:t>-0,050</w:t>
             </w:r>
           </w:p>
         </w:tc>
@@ -5876,7 +5934,7 @@
         <w:jc w:val="both"/>
       </w:pPr>
       <w:r>
-        <w:t>Остаток определён как фактическое значение минус прогноз. На рисунке 9 представлены train/test остатки двух прямых задач; широкий разброс подтверждает отсутствие устойчивой восстановленной зависимости.</w:t>
+        <w:t>Остаток определён как фактическое значение минус прогноз. На рисунке 9 представлены остатки обучающей и отложенной частей двух прямых задач. Их широкий разброс указывает на ограниченную точность испытанных моделей и сеток на данной таблице, но сам по себе не доказывает физического отсутствия зависимости.</w:t>
       </w:r>
     </w:p>
     <w:p>
@@ -5887,7 +5945,7 @@
       <w:r>
         <w:drawing>
           <wp:inline xmlns:a="http://schemas.openxmlformats.org/drawingml/2006/main" xmlns:pic="http://schemas.openxmlformats.org/drawingml/2006/picture">
-            <wp:extent cx="4320000" cy="7535342"/>
+            <wp:extent cx="3780000" cy="6593425"/>
             <wp:docPr id="9" name="Picture 9"/>
             <wp:cNvGraphicFramePr>
               <a:graphicFrameLocks noChangeAspect="1"/>
@@ -5908,7 +5966,7 @@
                   <pic:spPr>
                     <a:xfrm>
                       <a:off x="0" y="0"/>
-                      <a:ext cx="4320000" cy="7535342"/>
+                      <a:ext cx="3780000" cy="6593425"/>
                     </a:xfrm>
                     <a:prstGeom prst="rect"/>
                   </pic:spPr>
@@ -5944,6 +6002,14 @@
       </w:pPr>
       <w:r>
         <w:t>Permutation importance рассчитана на test по росту RMSE после перестановки признака, 10 повторов, seed 42; для модели прочности результат дан на рисунке 10. Для baseline-модуля все значения равны нулю: постоянная модель не использует признаки. Это не доказывает их физическую незначимость; отрицательные оценки не трактуются как причинный эффект.</w:t>
+      </w:r>
+    </w:p>
+    <w:p>
+      <w:pPr>
+        <w:jc w:val="both"/>
+      </w:pPr>
+      <w:r>
+        <w:t>SHAP является отдельным теоретическим подходом к аддитивному объяснению локальных прогнозов [18]; в данном исследовании рассчитана именно пермутационная важность, поэтому эти методы не смешиваются.</w:t>
       </w:r>
     </w:p>
     <w:p>
@@ -6018,7 +6084,7 @@
         <w:jc w:val="both"/>
       </w:pPr>
       <w:r>
-        <w:t>Для отношения матрица–наполнитель выбрана raw MLPRegressor с архитектурой (32, 16), ReLU, Adam, alpha=0,01 и ранней остановкой. CV RMSE равен 0,935 ± 0,058, тогда как baseline получил 0,906 ± 0,047; нейросеть хуже простого прогноза среднего.</w:t>
+        <w:t>Выбрана MLPRegressor 12–32–16–1 без удаления IQR-кандидатов, с ReLU, Adam, alpha=0,01 и ранней остановкой. Квадратичная ошибка вычисляется для стандартизованной цели, L2-штраф применяется к весам. CV RMSE равна 0,935 ± 0,058 против 0,906 ± 0,047 у константной модели.</w:t>
       </w:r>
     </w:p>
     <w:p>
@@ -6026,7 +6092,15 @@
         <w:jc w:val="both"/>
       </w:pPr>
       <w:r>
-        <w:t>Финальный fit остановился на 76-й итерации без предупреждений сходимости. Seeds 42, 43 и 44 дали близкие CV RMSE около 0,94–0,95; seed не выбирался по test. Потери соответствуют ½MSE с L2-регуляризацией стандартизованной цели. Оценка наблюдаемого отношения по 12 характеристикам не является физически оптимальной рецептурой или причинной рекомендацией.</w:t>
+        <w:t>Обучение завершилось после 76 эпох с восстановлением весов эпохи 35. Из 716 строк 644 обновляют веса, 72 используются для ранней остановки; масштабирование X/y оценено до этого разбиения, поэтому внутренняя кривая не полностью независима, а внешние фолды и отложенная часть изолированы. random_state 42–44 меняет веса, внутреннее разбиение и мини-батчи.</w:t>
+      </w:r>
+    </w:p>
+    <w:p>
+      <w:pPr>
+        <w:jc w:val="both"/>
+      </w:pPr>
+      <w:r>
+        <w:t>Обратная регрессия оценивает отношение по полному профилю, включая заданные механические свойства. Из-за проигрыша константной модели, отсутствия причинности и физической проверки результат нельзя считать надёжной рекомендацией рецептуры.</w:t>
       </w:r>
     </w:p>
     <w:p>
@@ -6320,7 +6394,7 @@
                 <w:color w:val="000000"/>
                 <w:sz w:val="24"/>
               </w:rPr>
-              <w:t>0.907</w:t>
+              <w:t>0,907</w:t>
             </w:r>
           </w:p>
         </w:tc>
@@ -6341,7 +6415,7 @@
                 <w:color w:val="000000"/>
                 <w:sz w:val="24"/>
               </w:rPr>
-              <w:t>0.926</w:t>
+              <w:t>0,926</w:t>
             </w:r>
           </w:p>
         </w:tc>
@@ -6362,7 +6436,7 @@
                 <w:color w:val="000000"/>
                 <w:sz w:val="24"/>
               </w:rPr>
-              <w:t>0.752</w:t>
+              <w:t>0,752</w:t>
             </w:r>
           </w:p>
         </w:tc>
@@ -6383,7 +6457,7 @@
                 <w:color w:val="000000"/>
                 <w:sz w:val="24"/>
               </w:rPr>
-              <w:t>-0.001</w:t>
+              <w:t>-0,001</w:t>
             </w:r>
           </w:p>
         </w:tc>
@@ -6427,7 +6501,7 @@
                 <w:color w:val="000000"/>
                 <w:sz w:val="24"/>
               </w:rPr>
-              <w:t>0.870</w:t>
+              <w:t>0,870</w:t>
             </w:r>
           </w:p>
         </w:tc>
@@ -6448,7 +6522,7 @@
                 <w:color w:val="000000"/>
                 <w:sz w:val="24"/>
               </w:rPr>
-              <w:t>0.944</w:t>
+              <w:t>0,944</w:t>
             </w:r>
           </w:p>
         </w:tc>
@@ -6469,7 +6543,7 @@
                 <w:color w:val="000000"/>
                 <w:sz w:val="24"/>
               </w:rPr>
-              <w:t>0.777</w:t>
+              <w:t>0,777</w:t>
             </w:r>
           </w:p>
         </w:tc>
@@ -6490,7 +6564,7 @@
                 <w:color w:val="000000"/>
                 <w:sz w:val="24"/>
               </w:rPr>
-              <w:t>-0.040</w:t>
+              <w:t>-0,040</w:t>
             </w:r>
           </w:p>
         </w:tc>
@@ -6498,13 +6572,14 @@
     </w:tbl>
     <w:p>
       <w:pPr>
+        <w:spacing w:before="120"/>
         <w:ind w:firstLine="0"/>
         <w:jc w:val="center"/>
       </w:pPr>
       <w:r>
         <w:drawing>
           <wp:inline xmlns:a="http://schemas.openxmlformats.org/drawingml/2006/main" xmlns:pic="http://schemas.openxmlformats.org/drawingml/2006/picture">
-            <wp:extent cx="5220000" cy="2037073"/>
+            <wp:extent cx="5760000" cy="2250108"/>
             <wp:docPr id="11" name="Picture 11"/>
             <wp:cNvGraphicFramePr>
               <a:graphicFrameLocks noChangeAspect="1"/>
@@ -6525,7 +6600,7 @@
                   <pic:spPr>
                     <a:xfrm>
                       <a:off x="0" y="0"/>
-                      <a:ext cx="5220000" cy="2037073"/>
+                      <a:ext cx="5760000" cy="2250108"/>
                     </a:xfrm>
                     <a:prstGeom prst="rect"/>
                   </pic:spPr>
@@ -6542,7 +6617,7 @@
         <w:jc w:val="center"/>
       </w:pPr>
       <w:r>
-        <w:t>Рисунок 11 – Диагностика обучения MLP и устойчивость CV по трём seed</w:t>
+        <w:t>Рисунок 11 – Диагностика обучения MLP и вариативность CV при трёх random_state</w:t>
       </w:r>
     </w:p>
     <w:p>
@@ -6583,7 +6658,15 @@
         <w:jc w:val="both"/>
       </w:pPr>
       <w:r>
-        <w:t>Воспроизводимость требует фиксировать данные и INNER JOIN, версии, разбиение, seed, pipeline, поиск, метрики и модели [20]. Публичный репозиторий: https://github.com/fpvcstep/composites-property-prediction; коммиты 50ef93f, 2cbd05f и ccb6796. В чистой копии прошли 35 тестов; 24 метрики и 12 276 прогнозов совпали (max Δ=0).</w:t>
+        <w:t>Воспроизводимость требует фиксировать исходные данные, способ объединения, версии зависимостей, разбиение, random_state, последовательность преобразований, поиск гиперпараметров, метрики и сохранённые модели [20]. Профиль автора: https://github.com/fpvcstep. Публичный репозиторий: https://github.com/fpvcstep/composites-property-prediction; история изменений: https://github.com/fpvcstep/composites-property-prediction/commits/main.</w:t>
+      </w:r>
+    </w:p>
+    <w:p>
+      <w:pPr>
+        <w:jc w:val="both"/>
+      </w:pPr>
+      <w:r>
+        <w:t>Исследование воспроизводится последовательными командами аудита, подготовки данных, разведочного анализа, обучения и итоговой оценки, указанными в README. Зафиксированные разбиение и версии зависимостей связывают опубликованные таблицы, рисунки и модели с исходными файлами. Контейнер собирается по Dockerfile; изменяемый тег базового образа и незакреплённая версия pip ограничивают архивную воспроизводимость среды.</w:t>
       </w:r>
     </w:p>
     <w:p>
@@ -6600,7 +6683,7 @@
         <w:jc w:val="both"/>
       </w:pPr>
       <w:r>
-        <w:t>Выполнены аудит, INNER JOIN, фиксированное разбиение 716/307 и EDA только на train. Максимум |Pearson| равен 0,1190618657 и сам по себе не определяет моделируемость.</w:t>
+        <w:t>Проверены две исходные таблицы и объединены 1023 наблюдения. Разбиение 716/307 отделяет выбор решений от итоговой оценки. В обучающей части нет пропусков и полных дубликатов; максимум |Pearson| равен 0,119. Кандидаты по правилу 1,5 IQR не признаны ошибками без предметного основания.</w:t>
       </w:r>
     </w:p>
     <w:p>
@@ -6608,7 +6691,31 @@
         <w:jc w:val="both"/>
       </w:pPr>
       <w:r>
-        <w:t>По CV для модуля baseline лучше классических моделей; преимущество Gradient Boosting по прочности всего 0,291 МПа, MLP отношения также уступает baseline. На test выбранные модели получили R² −0,016; 0,008 и −0,040. Результаты не подтверждают выбор оптимального состава или промышленную точность.</w:t>
+        <w:t>IQR-фильтрация оставляла 663 строки для обеих прямых задач и 655 для обратной регрессии, но не улучшила выбранные конфигурации по средней CV RMSE. Для модуля среди испытанных моделей выбрана константа; на отложенной части RMSE равна 3,178 ГПа, MAE 2,556 ГПа, R² −0,016.</w:t>
+      </w:r>
+    </w:p>
+    <w:p>
+      <w:pPr>
+        <w:jc w:val="both"/>
+      </w:pPr>
+      <w:r>
+        <w:t>Для прочности выбран Gradient Boosting. Он лучше константной модели в 4 из 10 фолдов; парная разность RMSE равна +0,291 ± 8,345 МПа. На отложенной части RMSE составляет 471,410 МПа, MAE 380,152 МПа, R² 0,008. Значимое устойчивое превосходство не установлено.</w:t>
+      </w:r>
+    </w:p>
+    <w:p>
+      <w:pPr>
+        <w:jc w:val="both"/>
+      </w:pPr>
+      <w:r>
+        <w:t>MLP 12–32–16–1 оценивает отношение по полному профилю, но уступает константной модели: RMSE 0,944 и R² −0,040. Без причинной и экспериментальной проверки обратная регрессия не является надёжной рекомендацией рецептуры. Приложение демонстрирует два прямых прогноза и предупреждает о выходе за обучающие диапазоны.</w:t>
+      </w:r>
+    </w:p>
+    <w:p>
+      <w:pPr>
+        <w:jc w:val="both"/>
+      </w:pPr>
+      <w:r>
+        <w:t>Команды, разбиение, версии зависимостей, таблицы, рисунки и модели обеспечивают проверяемость. Выводы относятся к случайно отложенным строкам этой таблицы: происхождение, группы опытов и часть единиц неизвестны, внешняя проверка отсутствует. Нужны паспорт данных, групповое или внешнее испытание и новые лабораторные наблюдения; до этого прогнозы не заменяют измерения.</w:t>
       </w:r>
     </w:p>
     <w:p>
@@ -6671,7 +6778,7 @@
         <w:ind w:firstLine="709"/>
       </w:pPr>
       <w:r>
-        <w:t>6 Breiman L.. Random Forests. Machine Learning 45, 5–32, 2001. DOI: 10.1023/A:1010933404324.</w:t>
+        <w:t>6 Breiman L. Random Forests. Machine Learning 45, 5–32, 2001. DOI: 10.1023/A:1010933404324.</w:t>
       </w:r>
     </w:p>
     <w:p>
@@ -6680,7 +6787,7 @@
         <w:ind w:firstLine="709"/>
       </w:pPr>
       <w:r>
-        <w:t>7 Browning C.E., Husman G.E., Whitney J.M.. Moisture Effects in Epoxy Matrix Composites. Composite Materials: Testing and Design (Fourth Conference), ASTM STP 617, 1977, pp. 481–496, 1977. DOI: 10.1520/STP26961S.</w:t>
+        <w:t>7 Browning C.E., Husman G.E., Whitney J.M. Moisture Effects in Epoxy Matrix Composites. Composite Materials: Testing and Design (Fourth Conference), ASTM STP 617, 1977, pp. 481–496. DOI: 10.1520/STP26961S.</w:t>
       </w:r>
     </w:p>
     <w:p>
@@ -6689,7 +6796,7 @@
         <w:ind w:firstLine="709"/>
       </w:pPr>
       <w:r>
-        <w:t>8 Campbell F.C.. Manufacturing Processes for Advanced Composites. Elsevier Science, 2003. DOI: 10.1016/B978-1-85617-415-2.X5000-X.</w:t>
+        <w:t>8 Campbell F.C. Manufacturing Processes for Advanced Composites. Elsevier Science, 2003. DOI: 10.1016/B978-1-85617-415-2.X5000-X.</w:t>
       </w:r>
     </w:p>
     <w:p>
@@ -6707,7 +6814,7 @@
         <w:ind w:firstLine="709"/>
       </w:pPr>
       <w:r>
-        <w:t>9 Cawley G.C., Talbot N.L.C.. On Over-fitting in Model Selection and Subsequent Selection Bias in Performance Evaluation. Journal of Machine Learning Research 11, 2079–2107, 2010. https://www.jmlr.org/papers/v11/cawley10a.html. Дата обращения: 24.09.2026.</w:t>
+        <w:t>9 Cawley G.C., Talbot N.L.C. On Over-fitting in Model Selection and Subsequent Selection Bias in Performance Evaluation. Journal of Machine Learning Research 11, 2079–2107, 2010. https://www.jmlr.org/papers/v11/cawley10a.html. Дата обращения: 24.09.2026.</w:t>
       </w:r>
     </w:p>
     <w:p>
@@ -6716,7 +6823,7 @@
         <w:ind w:firstLine="709"/>
       </w:pPr>
       <w:r>
-        <w:t>10 Chicco D., Warrens M.J., Jurman G.. The Coefficient of Determination R-squared Is More Informative than SMAPE, MAE, MAPE, MSE and RMSE in Regression Analysis Evaluation. PeerJ Computer Science 7:e623, 2021. DOI: 10.7717/peerj-cs.623.</w:t>
+        <w:t>10 Chicco D., Warrens M.J., Jurman G. The Coefficient of Determination R-squared Is More Informative than SMAPE, MAE, MAPE, MSE and RMSE in Regression Analysis Evaluation. PeerJ Computer Science 7:e623, 2021. DOI: 10.7717/peerj-cs.623.</w:t>
       </w:r>
     </w:p>
     <w:p>
@@ -6725,7 +6832,7 @@
         <w:ind w:firstLine="709"/>
       </w:pPr>
       <w:r>
-        <w:t>11 Cortes C., Vapnik V.. Support-Vector Networks. Machine Learning 20, 273–297, 1995. DOI: 10.1007/BF00994018.</w:t>
+        <w:t>11 Cortes C., Vapnik V. Support-Vector Networks. Machine Learning 20, 273–297, 1995. DOI: 10.1007/BF00994018.</w:t>
       </w:r>
     </w:p>
     <w:p>
@@ -6734,7 +6841,7 @@
         <w:ind w:firstLine="709"/>
       </w:pPr>
       <w:r>
-        <w:t>12 Drucker H., Burges C.J.C., Kaufman L. et al.. Support Vector Regression Machines. Advances in Neural Information Processing Systems 9, 1996. https://papers.nips.cc/paper/1996/hash/d38901788c533e8286cb6400b40b386d-Abstract.html. Дата обращения: 24.09.2026.</w:t>
+        <w:t>12 Drucker H., Burges C.J.C., Kaufman L. et al. Support Vector Regression Machines. Advances in Neural Information Processing Systems 9, 1996. https://papers.nips.cc/paper/1996/hash/d38901788c533e8286cb6400b40b386d-Abstract.html. Дата обращения: 24.09.2026.</w:t>
       </w:r>
     </w:p>
     <w:p>
@@ -6743,7 +6850,7 @@
         <w:ind w:firstLine="709"/>
       </w:pPr>
       <w:r>
-        <w:t>13 Friedman J.H.. Greedy Function Approximation: A Gradient Boosting Machine. The Annals of Statistics 29(5), 1189–1232, 2001. DOI: 10.1214/aos/1013203451.</w:t>
+        <w:t>13 Friedman J.H. Greedy Function Approximation: A Gradient Boosting Machine. The Annals of Statistics 29(5), 1189–1232, 2001. DOI: 10.1214/aos/1013203451.</w:t>
       </w:r>
     </w:p>
     <w:p>
@@ -6752,7 +6859,7 @@
         <w:ind w:firstLine="709"/>
       </w:pPr>
       <w:r>
-        <w:t>14 Gibson R.F.. Principles of Composite Material Mechanics. CRC Press, 2016. https://www.routledge.com/Principles-of-Composite-Material-Mechanics-Fourth-Edition-4th-Edition/Gibson/p/book/9781498720694. Дата обращения: 24.09.2026.</w:t>
+        <w:t>14 Gibson R.F. Principles of Composite Material Mechanics. CRC Press, 2016. https://www.routledge.com/Principles-of-Composite-Material-Mechanics-Fourth-Edition-4th-Edition/Gibson/p/book/9781498720694. Дата обращения: 24.09.2026.</w:t>
       </w:r>
     </w:p>
     <w:p>
@@ -6761,7 +6868,7 @@
         <w:ind w:firstLine="709"/>
       </w:pPr>
       <w:r>
-        <w:t>15 Hoerl A.E., Kennard R.W.. Ridge Regression: Biased Estimation for Nonorthogonal Problems. Technometrics 12(1), 55–67, 1970. DOI: 10.1080/00401706.1970.10488634.</w:t>
+        <w:t>15 Hoerl A.E., Kennard R.W. Ridge Regression: Biased Estimation for Nonorthogonal Problems. Technometrics 12(1), 55–67, 1970. DOI: 10.1080/00401706.1970.10488634.</w:t>
       </w:r>
     </w:p>
     <w:p>
@@ -6770,7 +6877,7 @@
         <w:ind w:firstLine="709"/>
       </w:pPr>
       <w:r>
-        <w:t>16 Jones F.R.. Composites Science, Technology, and Engineering. Cambridge University Press, 2022. DOI: 10.1017/9781139565943.</w:t>
+        <w:t>16 Jones F.R. Composites Science, Technology, and Engineering. Cambridge University Press, 2022. DOI: 10.1017/9781139565943.</w:t>
       </w:r>
     </w:p>
     <w:p>
@@ -6788,7 +6895,7 @@
         <w:ind w:firstLine="709"/>
       </w:pPr>
       <w:r>
-        <w:t>17 Kohavi R.. A Study of Cross-Validation and Bootstrap for Accuracy Estimation and Model Selection. Proceedings of IJCAI 1995, 1137–1143, 1995. https://www.ijcai.org/Proceedings/95-2/Papers/016.pdf. Дата обращения: 24.09.2026.</w:t>
+        <w:t>17 Kohavi R. A Study of Cross-Validation and Bootstrap for Accuracy Estimation and Model Selection. Proceedings of IJCAI 1995, 1137–1143. https://www.ijcai.org/Proceedings/95-2/Papers/016.pdf. Дата обращения: 24.09.2026.</w:t>
       </w:r>
     </w:p>
     <w:p>
@@ -6797,7 +6904,7 @@
         <w:ind w:firstLine="709"/>
       </w:pPr>
       <w:r>
-        <w:t>18 Lundberg S.M., Lee S.I.. A Unified Approach to Interpreting Model Predictions. Advances in Neural Information Processing Systems 30, 2017. https://papers.nips.cc/paper/2017/hash/8a20a8621978632d76c43dfd28b67767-Abstract.html. Дата обращения: 24.09.2026.</w:t>
+        <w:t>18 Lundberg S.M., Lee S. A Unified Approach to Interpreting Model Predictions. Advances in Neural Information Processing Systems 30, 2017. https://papers.nips.cc/paper/2017/hash/8a20a8621978632d76c43dfd28b67767-Abstract.html. Дата обращения: 24.09.2026.</w:t>
       </w:r>
     </w:p>
     <w:p>
@@ -6806,7 +6913,7 @@
         <w:ind w:firstLine="709"/>
       </w:pPr>
       <w:r>
-        <w:t>19 Pedregosa F., Varoquaux G., Gramfort A. et al.. Scikit-learn: Machine Learning in Python. Journal of Machine Learning Research 12, 2825–2830, 2011. https://www.jmlr.org/papers/v12/pedregosa11a.html. Дата обращения: 24.09.2026.</w:t>
+        <w:t>19 Pedregosa F., Varoquaux G., Gramfort A. et al. Scikit-learn: Machine Learning in Python. Journal of Machine Learning Research 12, 2825–2830, 2011. https://www.jmlr.org/papers/v12/pedregosa11a.html. Дата обращения: 24.09.2026.</w:t>
       </w:r>
     </w:p>
     <w:p>
@@ -6815,7 +6922,7 @@
         <w:ind w:firstLine="709"/>
       </w:pPr>
       <w:r>
-        <w:t>20 Pineau J., Lamarre P.V., Sinha K. et al.. Improving Reproducibility in Machine Learning Research: A Report from the NeurIPS 2019 Reproducibility Program. Journal of Machine Learning Research 22(164), 1–20, 2021. https://jmlr.org/papers/v22/20-303.html. Дата обращения: 24.09.2026.</w:t>
+        <w:t>20 Pineau J., Vincent-Lamarre P., Sinha K. et al. Improving Reproducibility in Machine Learning Research: A Report from the NeurIPS 2019 Reproducibility Program. Journal of Machine Learning Research 22(164), 1–20, 2021. https://jmlr.org/papers/v22/20-303.html. Дата обращения: 24.09.2026.</w:t>
       </w:r>
     </w:p>
     <w:p>
@@ -6824,7 +6931,7 @@
         <w:ind w:firstLine="709"/>
       </w:pPr>
       <w:r>
-        <w:t>21 Pinnell M., Fields R., Zabora R.. Results of an Interlaboratory Study of the ASTM Standard Test Method for Tensile Properties of Polymer Matrix Composites D 3039. Journal of Testing and Evaluation 33(1), 2005. DOI: 10.1520/JTE12521.</w:t>
+        <w:t>21 Pinnell M., Fields R., Zabora R. Results of an Interlaboratory Study of the ASTM Standard Test Method for Tensile Properties of Polymer Matrix Composites D 3039. Journal of Testing and Evaluation 33(1), 2005. DOI: 10.1520/JTE12521.</w:t>
       </w:r>
     </w:p>
     <w:p>
@@ -6833,7 +6940,7 @@
         <w:ind w:firstLine="709"/>
       </w:pPr>
       <w:r>
-        <w:t>22 Rumelhart D.E., Hinton G.E., Williams R.J.. Learning Representations by Back-propagating Errors. Nature 323, 533–536, 1986. DOI: 10.1038/323533a0.</w:t>
+        <w:t>22 Rumelhart D.E., Hinton G.E., Williams R.J. Learning Representations by Back-propagating Errors. Nature 323, 533–536, 1986. DOI: 10.1038/323533a0.</w:t>
       </w:r>
     </w:p>
     <w:p>
@@ -6842,7 +6949,7 @@
         <w:ind w:firstLine="709"/>
       </w:pPr>
       <w:r>
-        <w:t>23 Srivastava N., Hinton G., Krizhevsky A. et al.. Dropout: A Simple Way to Prevent Neural Networks from Overfitting. Journal of Machine Learning Research 15, 1929–1958, 2014. https://www.jmlr.org/papers/v15/srivastava14a.html. Дата обращения: 24.09.2026.</w:t>
+        <w:t>23 Srivastava N., Hinton G., Krizhevsky A. et al. Dropout: A Simple Way to Prevent Neural Networks from Overfitting. Journal of Machine Learning Research 15, 1929–1958, 2014. https://www.jmlr.org/papers/v15/srivastava14a.html. Дата обращения: 24.09.2026.</w:t>
       </w:r>
     </w:p>
     <w:p>
@@ -6860,7 +6967,7 @@
         <w:ind w:firstLine="709"/>
       </w:pPr>
       <w:r>
-        <w:t>24 Varma S., Simon R.. Bias in Error Estimation When Using Cross-Validation for Model Selection. BMC Bioinformatics 7, 91, 2006. DOI: 10.1186/1471-2105-7-91.</w:t>
+        <w:t>24 Varma S., Simon R. Bias in Error Estimation When Using Cross-Validation for Model Selection. BMC Bioinformatics 7, 91, 2006. DOI: 10.1186/1471-2105-7-91.</w:t>
       </w:r>
     </w:p>
     <w:p>

</xml_diff>